<commit_message>
fix: harden cross-browser identity flow
</commit_message>
<xml_diff>
--- a/docs/Informe_Proyecto_Clave.docx
+++ b/docs/Informe_Proyecto_Clave.docx
@@ -369,7 +369,7 @@
           <w:color w:val="000000"/>
           <w:sz w:val="22"/>
         </w:rPr>
-        <w:t xml:space="preserve">Durante la ejecución se hicieron dos ajustes relevantes. Primero, la autenticación del WebSocket pasó al primer mensaje de la conexión para evitar que el token apareciera en la URL o en registros de acceso. Segundo, las claves privadas se almacenaron como objetos </w:t>
+        <w:t>Durante la ejecución se hicieron tres ajustes relevantes. Primero, la autenticación del WebSocket pasó al primer mensaje de la conexión para evitar que el token apareciera en la URL o en registros de acceso. Segundo, las claves privadas se cifran con AES-256-GCM antes de guardarse en IndexedDB; la clave de protección se deriva de la contraseña con PBKDF2-SHA-256 y 310 000 iteraciones. Al iniciar sesión se descifran en memoria y se importan como objetos CryptoKey no extraíbles. Esto evita un problema de Safari al persistir directamente claves X25519 no extraíbles. Tercero, el cliente valida que las claves privadas recuperadas correspondan a las claves públicas registradas. Los ajustes surgieron al revisar el flujo completo y no solo el algoritmo de cifrado.</w:t>
       </w:r>
       <w:r>
         <w:rPr>
@@ -377,7 +377,6 @@
           <w:color w:val="000000"/>
           <w:sz w:val="21"/>
         </w:rPr>
-        <w:t>CryptoKey</w:t>
       </w:r>
       <w:r>
         <w:rPr>
@@ -385,7 +384,6 @@
           <w:color w:val="000000"/>
           <w:sz w:val="22"/>
         </w:rPr>
-        <w:t xml:space="preserve"> no extraíbles en IndexedDB, en lugar de exportarlas como texto. Ambos cambios surgieron al revisar el flujo completo y no solo el algoritmo de cifrado.</w:t>
       </w:r>
     </w:p>
     <w:p>
@@ -2005,33 +2003,8 @@
             <w:vAlign w:val="center"/>
           </w:tcPr>
           <w:p>
-            <w:pPr>
-              <w:spacing w:after="0" w:line="240" w:lineRule="auto"/>
-              <w:jc w:val="left"/>
-            </w:pPr>
             <w:r>
-              <w:rPr>
-                <w:rFonts w:ascii="Arial" w:hAnsi="Arial"/>
-                <w:color w:val="000000"/>
-                <w:sz w:val="18"/>
-              </w:rPr>
-              <w:t xml:space="preserve">Se crean como </w:t>
-            </w:r>
-            <w:r>
-              <w:rPr>
-                <w:rFonts w:ascii="Courier New" w:hAnsi="Courier New"/>
-                <w:color w:val="000000"/>
-                <w:sz w:val="17"/>
-              </w:rPr>
-              <w:t>CryptoKey</w:t>
-            </w:r>
-            <w:r>
-              <w:rPr>
-                <w:rFonts w:ascii="Arial" w:hAnsi="Arial"/>
-                <w:color w:val="000000"/>
-                <w:sz w:val="18"/>
-              </w:rPr>
-              <w:t xml:space="preserve"> no extraíbles en IndexedDB</w:t>
+              <w:t>Se guardan cifradas en IndexedDB y se importan como CryptoKey no extraíbles solo en memoria</w:t>
             </w:r>
           </w:p>
         </w:tc>
@@ -2700,7 +2673,13 @@
           <w:color w:val="000000"/>
           <w:sz w:val="22"/>
         </w:rPr>
-        <w:t>4. Las claves privadas permanecen en IndexedDB como no extraíbles.</w:t>
+        <w:t>4. El cliente cifra las claves privadas con una clave derivada de la contraseña y guarda el paquete cifrado en IndexedDB.</w:t>
+      </w:r>
+    </w:p>
+    <w:p>
+      <w:pPr/>
+      <w:r>
+        <w:t>5. Al iniciar sesión, el cliente descifra el paquete en memoria y reimporta las claves como no extraíbles.</w:t>
       </w:r>
     </w:p>
     <w:p>
@@ -2714,7 +2693,7 @@
           <w:color w:val="000000"/>
           <w:sz w:val="22"/>
         </w:rPr>
-        <w:t>5. Antes de conversar, los usuarios comparan sus huellas por un canal distinto.</w:t>
+        <w:t>6. Antes de conversar, los usuarios comparan sus huellas por un canal distinto.</w:t>
       </w:r>
     </w:p>
     <w:p>
@@ -2820,7 +2799,7 @@
           <w:color w:val="000000"/>
           <w:sz w:val="22"/>
         </w:rPr>
-        <w:t xml:space="preserve">El backend utiliza Python, FastAPI, Uvicorn y SQLite. La autenticación y las sesiones se implementan en </w:t>
+        <w:t>El backend utiliza Python, FastAPI, Uvicorn y SQLite. La autenticación y las sesiones se implementan en app/auth.py; los modelos de persistencia se encuentran en app/db.py; y la API, validaciones y WebSocket se coordinan desde app/main.py. El frontend usa HTML, CSS y JavaScript sin frameworks externos. La criptografía se ejecuta con Web Crypto y el estado local se conserva en IndexedDB. Las claves privadas quedan cifradas con AES-256-GCM y una clave derivada de la contraseña mediante PBKDF2-SHA-256; solo se descifran en memoria durante la sesión.</w:t>
       </w:r>
       <w:r>
         <w:rPr>
@@ -2828,7 +2807,6 @@
           <w:color w:val="000000"/>
           <w:sz w:val="21"/>
         </w:rPr>
-        <w:t>app/auth.py</w:t>
       </w:r>
       <w:r>
         <w:rPr>
@@ -2836,7 +2814,6 @@
           <w:color w:val="000000"/>
           <w:sz w:val="22"/>
         </w:rPr>
-        <w:t xml:space="preserve">; los modelos de persistencia se encuentran en </w:t>
       </w:r>
       <w:r>
         <w:rPr>
@@ -2844,7 +2821,6 @@
           <w:color w:val="000000"/>
           <w:sz w:val="21"/>
         </w:rPr>
-        <w:t>app/db.py</w:t>
       </w:r>
       <w:r>
         <w:rPr>
@@ -2852,7 +2828,6 @@
           <w:color w:val="000000"/>
           <w:sz w:val="22"/>
         </w:rPr>
-        <w:t xml:space="preserve">; y la API, validaciones y WebSocket se coordinan desde </w:t>
       </w:r>
       <w:r>
         <w:rPr>
@@ -2860,7 +2835,6 @@
           <w:color w:val="000000"/>
           <w:sz w:val="21"/>
         </w:rPr>
-        <w:t>app/main.py</w:t>
       </w:r>
       <w:r>
         <w:rPr>
@@ -2868,7 +2842,6 @@
           <w:color w:val="000000"/>
           <w:sz w:val="22"/>
         </w:rPr>
-        <w:t>. El frontend usa HTML, CSS y JavaScript sin frameworks externos. La criptografía se ejecuta con Web Crypto y el estado local se conserva en IndexedDB.</w:t>
       </w:r>
     </w:p>
     <w:p>

</xml_diff>